<commit_message>
added link to the docx
</commit_message>
<xml_diff>
--- a/IGI/LR1/ИГИ Лр1 отчёт.docx
+++ b/IGI/LR1/ИГИ Лр1 отчёт.docx
@@ -8490,6 +8490,7 @@
       <w:r>
         <w:rPr>
           <w:rFonts w:ascii="Times New Roman" w:hAnsi="Times New Roman" w:cs="Times New Roman"/>
+          <w:noProof/>
           <w:sz w:val="28"/>
           <w:szCs w:val="28"/>
           <w:lang w:val="en-US"/>
@@ -8543,6 +8544,7 @@
       <w:r>
         <w:rPr>
           <w:rFonts w:ascii="Times New Roman" w:hAnsi="Times New Roman" w:cs="Times New Roman"/>
+          <w:noProof/>
           <w:sz w:val="28"/>
           <w:szCs w:val="28"/>
           <w:lang w:val="en-US"/>
@@ -8616,6 +8618,7 @@
       <w:r>
         <w:rPr>
           <w:rFonts w:ascii="Times New Roman" w:hAnsi="Times New Roman" w:cs="Times New Roman"/>
+          <w:noProof/>
           <w:sz w:val="28"/>
           <w:szCs w:val="28"/>
           <w:lang w:val="en-US"/>
@@ -8669,6 +8672,7 @@
       <w:r>
         <w:rPr>
           <w:rFonts w:ascii="Times New Roman" w:hAnsi="Times New Roman" w:cs="Times New Roman"/>
+          <w:noProof/>
           <w:sz w:val="28"/>
           <w:szCs w:val="28"/>
           <w:lang w:val="en-US"/>
@@ -8722,6 +8726,7 @@
       <w:r>
         <w:rPr>
           <w:rFonts w:ascii="Times New Roman" w:hAnsi="Times New Roman" w:cs="Times New Roman"/>
+          <w:noProof/>
           <w:sz w:val="28"/>
           <w:szCs w:val="28"/>
           <w:lang w:val="en-US"/>
@@ -8788,7 +8793,7 @@
           <w:rFonts w:ascii="Times New Roman" w:hAnsi="Times New Roman" w:cs="Times New Roman"/>
           <w:sz w:val="28"/>
           <w:szCs w:val="28"/>
-          <w:lang w:val="ru-RU"/>
+          <w:lang w:val="en-US"/>
         </w:rPr>
       </w:pPr>
       <w:r>
@@ -8831,6 +8836,25 @@
             </a:graphic>
           </wp:inline>
         </w:drawing>
+      </w:r>
+    </w:p>
+    <w:p>
+      <w:pPr>
+        <w:rPr>
+          <w:rFonts w:ascii="Times New Roman" w:hAnsi="Times New Roman" w:cs="Times New Roman"/>
+          <w:sz w:val="28"/>
+          <w:szCs w:val="28"/>
+          <w:lang w:val="en-US"/>
+        </w:rPr>
+      </w:pPr>
+      <w:r>
+        <w:rPr>
+          <w:rFonts w:ascii="Times New Roman" w:hAnsi="Times New Roman" w:cs="Times New Roman"/>
+          <w:sz w:val="28"/>
+          <w:szCs w:val="28"/>
+          <w:lang w:val="en-US"/>
+        </w:rPr>
+        <w:t>https://imfeelink.github.io/IGI_LR1_LastTask/</w:t>
       </w:r>
     </w:p>
     <w:sectPr>

</xml_diff>